<commit_message>
Add administrative catalogs and coordination edit guards
</commit_message>
<xml_diff>
--- a/docs/Manual_Entrega_Nomina_Docente.docx
+++ b/docs/Manual_Entrega_Nomina_Docente.docx
@@ -589,6 +589,21 @@
           <w:sz w:val="18"/>
         </w:rPr>
         <w:t>Administrador general protegido.</w:t>
+      </w:r>
+    </w:p>
+    <w:p>
+      <w:pPr>
+        <w:pStyle w:val="ListBullet"/>
+        <w:spacing w:after="40"/>
+      </w:pPr>
+      <w:r>
+        <w:rPr>
+          <w:rFonts w:ascii="Aptos" w:hAnsi="Aptos"/>
+          <w:b w:val="0"/>
+          <w:color w:val="334155"/>
+          <w:sz w:val="18"/>
+        </w:rPr>
+        <w:t>Catálogos administrativos para asignaturas y tabuladores.</w:t>
       </w:r>
     </w:p>
     <w:p>
@@ -5344,6 +5359,107 @@
           <w:p>
             <w:pPr>
               <w:spacing w:after="0"/>
+              <w:jc w:val="left"/>
+            </w:pPr>
+            <w:r>
+              <w:rPr>
+                <w:rFonts w:ascii="Aptos" w:hAnsi="Aptos"/>
+                <w:b w:val="0"/>
+                <w:color w:val="334155"/>
+                <w:sz w:val="16"/>
+              </w:rPr>
+              <w:t>Catálogos Administrativos</w:t>
+            </w:r>
+          </w:p>
+        </w:tc>
+        <w:tc>
+          <w:tcPr>
+            <w:tcW w:type="dxa" w:w="3437"/>
+            <w:vAlign w:val="center"/>
+            <w:tcMar>
+              <w:top w:w="110" w:type="dxa"/>
+              <w:start w:w="120" w:type="dxa"/>
+              <w:bottom w:w="110" w:type="dxa"/>
+              <w:end w:w="120" w:type="dxa"/>
+            </w:tcMar>
+            <w:tcBorders>
+              <w:top w:val="single" w:sz="4" w:space="0" w:color="B7D4CC"/>
+              <w:left w:val="single" w:sz="4" w:space="0" w:color="B7D4CC"/>
+              <w:bottom w:val="single" w:sz="4" w:space="0" w:color="B7D4CC"/>
+              <w:right w:val="single" w:sz="4" w:space="0" w:color="B7D4CC"/>
+            </w:tcBorders>
+          </w:tcPr>
+          <w:p>
+            <w:pPr>
+              <w:spacing w:after="0"/>
+              <w:jc w:val="center"/>
+            </w:pPr>
+            <w:r>
+              <w:rPr>
+                <w:rFonts w:ascii="Aptos" w:hAnsi="Aptos"/>
+                <w:b w:val="0"/>
+                <w:color w:val="334155"/>
+                <w:sz w:val="16"/>
+              </w:rPr>
+              <w:t>/catalogos</w:t>
+            </w:r>
+          </w:p>
+        </w:tc>
+        <w:tc>
+          <w:tcPr>
+            <w:tcW w:type="dxa" w:w="3437"/>
+            <w:vAlign w:val="center"/>
+            <w:tcMar>
+              <w:top w:w="110" w:type="dxa"/>
+              <w:start w:w="120" w:type="dxa"/>
+              <w:bottom w:w="110" w:type="dxa"/>
+              <w:end w:w="120" w:type="dxa"/>
+            </w:tcMar>
+            <w:tcBorders>
+              <w:top w:val="single" w:sz="4" w:space="0" w:color="B7D4CC"/>
+              <w:left w:val="single" w:sz="4" w:space="0" w:color="B7D4CC"/>
+              <w:bottom w:val="single" w:sz="4" w:space="0" w:color="B7D4CC"/>
+              <w:right w:val="single" w:sz="4" w:space="0" w:color="B7D4CC"/>
+            </w:tcBorders>
+          </w:tcPr>
+          <w:p>
+            <w:pPr>
+              <w:spacing w:after="0"/>
+              <w:jc w:val="left"/>
+            </w:pPr>
+            <w:r>
+              <w:rPr>
+                <w:rFonts w:ascii="Aptos" w:hAnsi="Aptos"/>
+                <w:b w:val="0"/>
+                <w:color w:val="334155"/>
+                <w:sz w:val="16"/>
+              </w:rPr>
+              <w:t>Asignaturas y tabuladores de pago</w:t>
+            </w:r>
+          </w:p>
+        </w:tc>
+      </w:tr>
+      <w:tr>
+        <w:tc>
+          <w:tcPr>
+            <w:tcW w:type="dxa" w:w="3437"/>
+            <w:vAlign w:val="center"/>
+            <w:tcMar>
+              <w:top w:w="110" w:type="dxa"/>
+              <w:start w:w="120" w:type="dxa"/>
+              <w:bottom w:w="110" w:type="dxa"/>
+              <w:end w:w="120" w:type="dxa"/>
+            </w:tcMar>
+            <w:tcBorders>
+              <w:top w:val="single" w:sz="4" w:space="0" w:color="B7D4CC"/>
+              <w:left w:val="single" w:sz="4" w:space="0" w:color="B7D4CC"/>
+              <w:bottom w:val="single" w:sz="4" w:space="0" w:color="B7D4CC"/>
+              <w:right w:val="single" w:sz="4" w:space="0" w:color="B7D4CC"/>
+            </w:tcBorders>
+          </w:tcPr>
+          <w:p>
+            <w:pPr>
+              <w:spacing w:after="0"/>
               <w:jc w:val="center"/>
             </w:pPr>
             <w:r>
@@ -6390,7 +6506,7 @@
         <w:pStyle w:val="Heading2"/>
       </w:pPr>
       <w:r>
-        <w:t>6.4 Directorio Docente</w:t>
+        <w:t>6.3.1 Catálogos Administrativos</w:t>
       </w:r>
     </w:p>
     <w:p>
@@ -6404,7 +6520,7 @@
           <w:color w:val="334155"/>
           <w:sz w:val="18"/>
         </w:rPr>
-        <w:t>Administra la base maestra de docentes. Incluye:</w:t>
+        <w:t>Módulo exclusivo para administradores. Permite gestionar los catálogos usados por captura de horarios, extras y nómina:</w:t>
       </w:r>
     </w:p>
     <w:p>
@@ -6419,7 +6535,7 @@
           <w:color w:val="334155"/>
           <w:sz w:val="18"/>
         </w:rPr>
-        <w:t>Nombre.</w:t>
+        <w:t>Alta y edición de asignaturas.</w:t>
       </w:r>
     </w:p>
     <w:p>
@@ -6434,7 +6550,7 @@
           <w:color w:val="334155"/>
           <w:sz w:val="18"/>
         </w:rPr>
-        <w:t>RFC.</w:t>
+        <w:t>Activación e inactivación de asignaturas.</w:t>
       </w:r>
     </w:p>
     <w:p>
@@ -6449,7 +6565,7 @@
           <w:color w:val="334155"/>
           <w:sz w:val="18"/>
         </w:rPr>
-        <w:t>Correo.</w:t>
+        <w:t>Alta y edición de tabuladores.</w:t>
       </w:r>
     </w:p>
     <w:p>
@@ -6464,7 +6580,7 @@
           <w:color w:val="334155"/>
           <w:sz w:val="18"/>
         </w:rPr>
-        <w:t>Teléfono.</w:t>
+        <w:t>Modificación del monto por hora.</w:t>
       </w:r>
     </w:p>
     <w:p>
@@ -6479,7 +6595,7 @@
           <w:color w:val="334155"/>
           <w:sz w:val="18"/>
         </w:rPr>
-        <w:t>Categoría docente.</w:t>
+        <w:t>Activación e inactivación de tabuladores.</w:t>
       </w:r>
     </w:p>
     <w:p>
@@ -6494,7 +6610,7 @@
           <w:color w:val="334155"/>
           <w:sz w:val="18"/>
         </w:rPr>
-        <w:t>Estatus ACTIVO / INACTIVO.</w:t>
+        <w:t>Orden de visualización de tabuladores.</w:t>
       </w:r>
     </w:p>
     <w:p>
@@ -6509,7 +6625,21 @@
           <w:color w:val="334155"/>
           <w:sz w:val="18"/>
         </w:rPr>
-        <w:t>Coordinación.</w:t>
+        <w:t>Consulta de uso operativo e histórico.</w:t>
+      </w:r>
+    </w:p>
+    <w:p>
+      <w:pPr>
+        <w:spacing w:after="100"/>
+      </w:pPr>
+      <w:r>
+        <w:rPr>
+          <w:rFonts w:ascii="Aptos" w:hAnsi="Aptos"/>
+          <w:b w:val="0"/>
+          <w:color w:val="334155"/>
+          <w:sz w:val="18"/>
+        </w:rPr>
+        <w:t>Reglas clave:</w:t>
       </w:r>
     </w:p>
     <w:p>
@@ -6524,7 +6654,7 @@
           <w:color w:val="334155"/>
           <w:sz w:val="18"/>
         </w:rPr>
-        <w:t>Tipo de pago.</w:t>
+        <w:t>Inactivar un catálogo lo oculta de nuevas capturas, pero conserva los históricos.</w:t>
       </w:r>
     </w:p>
     <w:p>
@@ -6539,7 +6669,7 @@
           <w:color w:val="334155"/>
           <w:sz w:val="18"/>
         </w:rPr>
-        <w:t>Datos bancarios.</w:t>
+        <w:t>Los horarios y nóminas guardadas conservan el nombre y monto capturado como snapshot.</w:t>
       </w:r>
     </w:p>
     <w:p>
@@ -6554,7 +6684,7 @@
           <w:color w:val="334155"/>
           <w:sz w:val="18"/>
         </w:rPr>
-        <w:t>Datos fiscales.</w:t>
+        <w:t>Cambiar un tabulador no recalcula nóminas históricas.</w:t>
       </w:r>
     </w:p>
     <w:p>
@@ -6569,7 +6699,15 @@
           <w:color w:val="334155"/>
           <w:sz w:val="18"/>
         </w:rPr>
-        <w:t>Constancia fiscal.</w:t>
+        <w:t>Las acciones quedan registradas en auditoría.</w:t>
+      </w:r>
+    </w:p>
+    <w:p>
+      <w:pPr>
+        <w:pStyle w:val="Heading2"/>
+      </w:pPr>
+      <w:r>
+        <w:t>6.4 Directorio Docente</w:t>
       </w:r>
     </w:p>
     <w:p>
@@ -6583,7 +6721,7 @@
           <w:color w:val="334155"/>
           <w:sz w:val="18"/>
         </w:rPr>
-        <w:t>Reglas clave:</w:t>
+        <w:t>Administra la base maestra de docentes. Incluye:</w:t>
       </w:r>
     </w:p>
     <w:p>
@@ -6598,7 +6736,7 @@
           <w:color w:val="334155"/>
           <w:sz w:val="18"/>
         </w:rPr>
-        <w:t>Solo docentes ACTIVO pueden participar en horarios y extras.</w:t>
+        <w:t>Nombre.</w:t>
       </w:r>
     </w:p>
     <w:p>
@@ -6613,7 +6751,7 @@
           <w:color w:val="334155"/>
           <w:sz w:val="18"/>
         </w:rPr>
-        <w:t>Los docentes pueden exportarse en CSV.</w:t>
+        <w:t>RFC.</w:t>
       </w:r>
     </w:p>
     <w:p>
@@ -6628,7 +6766,7 @@
           <w:color w:val="334155"/>
           <w:sz w:val="18"/>
         </w:rPr>
-        <w:t>Existe exportación de docentes activos.</w:t>
+        <w:t>Correo.</w:t>
       </w:r>
     </w:p>
     <w:p>
@@ -6643,7 +6781,7 @@
           <w:color w:val="334155"/>
           <w:sz w:val="18"/>
         </w:rPr>
-        <w:t>Existe exportación completa con historial de cambios.</w:t>
+        <w:t>Teléfono.</w:t>
       </w:r>
     </w:p>
     <w:p>
@@ -6658,20 +6796,13 @@
           <w:color w:val="334155"/>
           <w:sz w:val="18"/>
         </w:rPr>
-        <w:t>El borrado de docentes respeta dependencias operativas.</w:t>
-      </w:r>
-    </w:p>
-    <w:p>
-      <w:pPr>
-        <w:pStyle w:val="Heading2"/>
-      </w:pPr>
-      <w:r>
-        <w:t>6.5 Expediente Fiscal</w:t>
-      </w:r>
-    </w:p>
-    <w:p>
-      <w:pPr>
-        <w:spacing w:after="100"/>
+        <w:t>Categoría docente.</w:t>
+      </w:r>
+    </w:p>
+    <w:p>
+      <w:pPr>
+        <w:pStyle w:val="ListBullet"/>
+        <w:spacing w:after="40"/>
       </w:pPr>
       <w:r>
         <w:rPr>
@@ -6680,7 +6811,7 @@
           <w:color w:val="334155"/>
           <w:sz w:val="18"/>
         </w:rPr>
-        <w:t>Concentra información fiscal y bancaria para Finanzas/Contador. Permite:</w:t>
+        <w:t>Estatus ACTIVO / INACTIVO.</w:t>
       </w:r>
     </w:p>
     <w:p>
@@ -6695,7 +6826,7 @@
           <w:color w:val="334155"/>
           <w:sz w:val="18"/>
         </w:rPr>
-        <w:t>Revisar RFC, correo, datos bancarios y constancia.</w:t>
+        <w:t>Coordinación.</w:t>
       </w:r>
     </w:p>
     <w:p>
@@ -6710,7 +6841,7 @@
           <w:color w:val="334155"/>
           <w:sz w:val="18"/>
         </w:rPr>
-        <w:t>Ver vista previa de constancia fiscal.</w:t>
+        <w:t>Tipo de pago.</w:t>
       </w:r>
     </w:p>
     <w:p>
@@ -6725,7 +6856,7 @@
           <w:color w:val="334155"/>
           <w:sz w:val="18"/>
         </w:rPr>
-        <w:t>Descargar constancia fiscal.</w:t>
+        <w:t>Datos bancarios.</w:t>
       </w:r>
     </w:p>
     <w:p>
@@ -6740,7 +6871,7 @@
           <w:color w:val="334155"/>
           <w:sz w:val="18"/>
         </w:rPr>
-        <w:t>Editar datos fiscales desde el módulo.</w:t>
+        <w:t>Datos fiscales.</w:t>
       </w:r>
     </w:p>
     <w:p>
@@ -6755,7 +6886,7 @@
           <w:color w:val="334155"/>
           <w:sz w:val="18"/>
         </w:rPr>
-        <w:t>Exportar listado de cumpleaños.</w:t>
+        <w:t>Constancia fiscal.</w:t>
       </w:r>
     </w:p>
     <w:p>
@@ -6769,7 +6900,222 @@
           <w:color w:val="334155"/>
           <w:sz w:val="18"/>
         </w:rPr>
+        <w:t>Reglas clave:</w:t>
+      </w:r>
+    </w:p>
+    <w:p>
+      <w:pPr>
+        <w:pStyle w:val="ListBullet"/>
+        <w:spacing w:after="40"/>
+      </w:pPr>
+      <w:r>
+        <w:rPr>
+          <w:rFonts w:ascii="Aptos" w:hAnsi="Aptos"/>
+          <w:b w:val="0"/>
+          <w:color w:val="334155"/>
+          <w:sz w:val="18"/>
+        </w:rPr>
+        <w:t>Solo docentes ACTIVO pueden participar en horarios y extras.</w:t>
+      </w:r>
+    </w:p>
+    <w:p>
+      <w:pPr>
+        <w:pStyle w:val="ListBullet"/>
+        <w:spacing w:after="40"/>
+      </w:pPr>
+      <w:r>
+        <w:rPr>
+          <w:rFonts w:ascii="Aptos" w:hAnsi="Aptos"/>
+          <w:b w:val="0"/>
+          <w:color w:val="334155"/>
+          <w:sz w:val="18"/>
+        </w:rPr>
+        <w:t>Los docentes pueden exportarse en CSV.</w:t>
+      </w:r>
+    </w:p>
+    <w:p>
+      <w:pPr>
+        <w:pStyle w:val="ListBullet"/>
+        <w:spacing w:after="40"/>
+      </w:pPr>
+      <w:r>
+        <w:rPr>
+          <w:rFonts w:ascii="Aptos" w:hAnsi="Aptos"/>
+          <w:b w:val="0"/>
+          <w:color w:val="334155"/>
+          <w:sz w:val="18"/>
+        </w:rPr>
+        <w:t>Existe exportación de docentes activos.</w:t>
+      </w:r>
+    </w:p>
+    <w:p>
+      <w:pPr>
+        <w:pStyle w:val="ListBullet"/>
+        <w:spacing w:after="40"/>
+      </w:pPr>
+      <w:r>
+        <w:rPr>
+          <w:rFonts w:ascii="Aptos" w:hAnsi="Aptos"/>
+          <w:b w:val="0"/>
+          <w:color w:val="334155"/>
+          <w:sz w:val="18"/>
+        </w:rPr>
+        <w:t>Existe exportación completa con historial de cambios.</w:t>
+      </w:r>
+    </w:p>
+    <w:p>
+      <w:pPr>
+        <w:pStyle w:val="ListBullet"/>
+        <w:spacing w:after="40"/>
+      </w:pPr>
+      <w:r>
+        <w:rPr>
+          <w:rFonts w:ascii="Aptos" w:hAnsi="Aptos"/>
+          <w:b w:val="0"/>
+          <w:color w:val="334155"/>
+          <w:sz w:val="18"/>
+        </w:rPr>
+        <w:t>El borrado de docentes respeta dependencias operativas.</w:t>
+      </w:r>
+    </w:p>
+    <w:p>
+      <w:pPr>
+        <w:pStyle w:val="ListBullet"/>
+        <w:spacing w:after="40"/>
+      </w:pPr>
+      <w:r>
+        <w:rPr>
+          <w:rFonts w:ascii="Aptos" w:hAnsi="Aptos"/>
+          <w:b w:val="0"/>
+          <w:color w:val="334155"/>
+          <w:sz w:val="18"/>
+        </w:rPr>
+        <w:t>Los coordinadores solo pueden editar docentes de su coordinación; Admin puede editar cualquiera.</w:t>
+      </w:r>
+    </w:p>
+    <w:p>
+      <w:pPr>
+        <w:pStyle w:val="Heading2"/>
+      </w:pPr>
+      <w:r>
+        <w:t>6.5 Expediente Fiscal</w:t>
+      </w:r>
+    </w:p>
+    <w:p>
+      <w:pPr>
+        <w:spacing w:after="100"/>
+      </w:pPr>
+      <w:r>
+        <w:rPr>
+          <w:rFonts w:ascii="Aptos" w:hAnsi="Aptos"/>
+          <w:b w:val="0"/>
+          <w:color w:val="334155"/>
+          <w:sz w:val="18"/>
+        </w:rPr>
+        <w:t>Concentra información fiscal y bancaria para Finanzas/Contador. Permite:</w:t>
+      </w:r>
+    </w:p>
+    <w:p>
+      <w:pPr>
+        <w:pStyle w:val="ListBullet"/>
+        <w:spacing w:after="40"/>
+      </w:pPr>
+      <w:r>
+        <w:rPr>
+          <w:rFonts w:ascii="Aptos" w:hAnsi="Aptos"/>
+          <w:b w:val="0"/>
+          <w:color w:val="334155"/>
+          <w:sz w:val="18"/>
+        </w:rPr>
+        <w:t>Revisar RFC, correo, datos bancarios y constancia.</w:t>
+      </w:r>
+    </w:p>
+    <w:p>
+      <w:pPr>
+        <w:pStyle w:val="ListBullet"/>
+        <w:spacing w:after="40"/>
+      </w:pPr>
+      <w:r>
+        <w:rPr>
+          <w:rFonts w:ascii="Aptos" w:hAnsi="Aptos"/>
+          <w:b w:val="0"/>
+          <w:color w:val="334155"/>
+          <w:sz w:val="18"/>
+        </w:rPr>
+        <w:t>Ver vista previa de constancia fiscal.</w:t>
+      </w:r>
+    </w:p>
+    <w:p>
+      <w:pPr>
+        <w:pStyle w:val="ListBullet"/>
+        <w:spacing w:after="40"/>
+      </w:pPr>
+      <w:r>
+        <w:rPr>
+          <w:rFonts w:ascii="Aptos" w:hAnsi="Aptos"/>
+          <w:b w:val="0"/>
+          <w:color w:val="334155"/>
+          <w:sz w:val="18"/>
+        </w:rPr>
+        <w:t>Descargar constancia fiscal.</w:t>
+      </w:r>
+    </w:p>
+    <w:p>
+      <w:pPr>
+        <w:pStyle w:val="ListBullet"/>
+        <w:spacing w:after="40"/>
+      </w:pPr>
+      <w:r>
+        <w:rPr>
+          <w:rFonts w:ascii="Aptos" w:hAnsi="Aptos"/>
+          <w:b w:val="0"/>
+          <w:color w:val="334155"/>
+          <w:sz w:val="18"/>
+        </w:rPr>
+        <w:t>Editar datos fiscales desde el módulo.</w:t>
+      </w:r>
+    </w:p>
+    <w:p>
+      <w:pPr>
+        <w:pStyle w:val="ListBullet"/>
+        <w:spacing w:after="40"/>
+      </w:pPr>
+      <w:r>
+        <w:rPr>
+          <w:rFonts w:ascii="Aptos" w:hAnsi="Aptos"/>
+          <w:b w:val="0"/>
+          <w:color w:val="334155"/>
+          <w:sz w:val="18"/>
+        </w:rPr>
+        <w:t>Exportar listado de cumpleaños.</w:t>
+      </w:r>
+    </w:p>
+    <w:p>
+      <w:pPr>
+        <w:spacing w:after="100"/>
+      </w:pPr>
+      <w:r>
+        <w:rPr>
+          <w:rFonts w:ascii="Aptos" w:hAnsi="Aptos"/>
+          <w:b w:val="0"/>
+          <w:color w:val="334155"/>
+          <w:sz w:val="18"/>
+        </w:rPr>
         <w:t>La fecha de nacimiento se calcula desde RFC cuando el formato lo permite.</w:t>
+      </w:r>
+    </w:p>
+    <w:p>
+      <w:pPr>
+        <w:spacing w:after="100"/>
+      </w:pPr>
+      <w:r>
+        <w:rPr>
+          <w:rFonts w:ascii="Aptos" w:hAnsi="Aptos"/>
+          <w:b w:val="0"/>
+          <w:color w:val="334155"/>
+          <w:sz w:val="18"/>
+        </w:rPr>
+        <w:t>Los coordinadores solo pueden actualizar expedientes de docentes de su coordinación; Admin y Finanzas pueden gestionar expedientes de forma global.</w:t>
       </w:r>
     </w:p>
     <w:p>

</xml_diff>

<commit_message>
docs(h22): close teacher import predeploy validation
</commit_message>
<xml_diff>
--- a/docs/Manual_Entrega_Nomina_Docente.docx
+++ b/docs/Manual_Entrega_Nomina_Docente.docx
@@ -104,7 +104,7 @@
                 <w:color w:val="334155"/>
                 <w:sz w:val="19"/>
               </w:rPr>
-              <w:t>1.1 post-H20</w:t>
+              <w:t>1.0 productiva</w:t>
             </w:r>
           </w:p>
         </w:tc>
@@ -171,7 +171,7 @@
                 <w:color w:val="334155"/>
                 <w:sz w:val="19"/>
               </w:rPr>
-              <w:t>18 de julio de 2026</w:t>
+              <w:t>8 de mayo de 2026</w:t>
             </w:r>
           </w:p>
         </w:tc>
@@ -7063,6 +7063,616 @@
         <w:pStyle w:val="Heading2"/>
       </w:pPr>
       <w:r>
+        <w:t>6.3.2 Importación CSV de docentes (H22)</w:t>
+      </w:r>
+    </w:p>
+    <w:p>
+      <w:pPr>
+        <w:spacing w:after="100"/>
+      </w:pPr>
+      <w:r>
+        <w:rPr>
+          <w:rFonts w:ascii="Aptos" w:hAnsi="Aptos"/>
+          <w:b w:val="0"/>
+          <w:color w:val="334155"/>
+          <w:sz w:val="18"/>
+        </w:rPr>
+        <w:t>Estado predeploy: preparada para el siguiente despliegue productivo H22.</w:t>
+      </w:r>
+    </w:p>
+    <w:p>
+      <w:pPr>
+        <w:spacing w:after="100"/>
+      </w:pPr>
+      <w:r>
+        <w:rPr>
+          <w:rFonts w:ascii="Aptos" w:hAnsi="Aptos"/>
+          <w:b w:val="0"/>
+          <w:color w:val="334155"/>
+          <w:sz w:val="18"/>
+        </w:rPr>
+        <w:t>La migración 014, API/Hosting y el smoke productivo permanecen pendientes.</w:t>
+      </w:r>
+    </w:p>
+    <w:p>
+      <w:pPr>
+        <w:spacing w:after="100"/>
+      </w:pPr>
+      <w:r>
+        <w:rPr>
+          <w:rFonts w:ascii="Aptos" w:hAnsi="Aptos"/>
+          <w:b w:val="0"/>
+          <w:color w:val="334155"/>
+          <w:sz w:val="18"/>
+        </w:rPr>
+        <w:t>H22 agrega la pestaña Admin</w:t>
+      </w:r>
+    </w:p>
+    <w:p>
+      <w:pPr>
+        <w:spacing w:after="100"/>
+      </w:pPr>
+      <w:r>
+        <w:rPr>
+          <w:rFonts w:ascii="Aptos" w:hAnsi="Aptos"/>
+          <w:b w:val="0"/>
+          <w:color w:val="334155"/>
+          <w:sz w:val="18"/>
+        </w:rPr>
+        <w:t>apps/web/src/components/catalogs/TeacherImportPanel.vue y tres endpoints:</w:t>
+      </w:r>
+    </w:p>
+    <w:p>
+      <w:pPr>
+        <w:keepNext/>
+      </w:pPr>
+      <w:r>
+        <w:rPr>
+          <w:rFonts w:ascii="Aptos" w:hAnsi="Aptos"/>
+          <w:b/>
+          <w:color w:val="0F766E"/>
+          <w:sz w:val="17"/>
+        </w:rPr>
+        <w:t>Bloque técnico</w:t>
+      </w:r>
+    </w:p>
+    <w:p>
+      <w:pPr>
+        <w:spacing w:after="0"/>
+        <w:ind w:left="317"/>
+      </w:pPr>
+      <w:r>
+        <w:rPr>
+          <w:rFonts w:ascii="Consolas" w:hAnsi="Consolas"/>
+          <w:color w:val="334155"/>
+          <w:sz w:val="15"/>
+        </w:rPr>
+        <w:t>GET  /api/teachers/import/template</w:t>
+      </w:r>
+    </w:p>
+    <w:p>
+      <w:pPr>
+        <w:spacing w:after="0"/>
+        <w:ind w:left="317"/>
+      </w:pPr>
+      <w:r>
+        <w:rPr>
+          <w:rFonts w:ascii="Consolas" w:hAnsi="Consolas"/>
+          <w:color w:val="334155"/>
+          <w:sz w:val="15"/>
+        </w:rPr>
+        <w:t>POST /api/teachers/import/preview</w:t>
+      </w:r>
+    </w:p>
+    <w:p>
+      <w:pPr>
+        <w:spacing w:after="0"/>
+        <w:ind w:left="317"/>
+      </w:pPr>
+      <w:r>
+        <w:rPr>
+          <w:rFonts w:ascii="Consolas" w:hAnsi="Consolas"/>
+          <w:color w:val="334155"/>
+          <w:sz w:val="15"/>
+        </w:rPr>
+        <w:t>POST /api/teachers/import/apply</w:t>
+      </w:r>
+    </w:p>
+    <w:p>
+      <w:pPr>
+        <w:spacing w:after="100"/>
+      </w:pPr>
+      <w:r>
+        <w:rPr>
+          <w:rFonts w:ascii="Aptos" w:hAnsi="Aptos"/>
+          <w:b w:val="0"/>
+          <w:color w:val="334155"/>
+          <w:sz w:val="18"/>
+        </w:rPr>
+        <w:t>Los tres usan guarda explícita Admin-only. La UI oculta la pestaña a</w:t>
+      </w:r>
+    </w:p>
+    <w:p>
+      <w:pPr>
+        <w:spacing w:after="100"/>
+      </w:pPr>
+      <w:r>
+        <w:rPr>
+          <w:rFonts w:ascii="Aptos" w:hAnsi="Aptos"/>
+          <w:b w:val="0"/>
+          <w:color w:val="334155"/>
+          <w:sz w:val="18"/>
+        </w:rPr>
+        <w:t>Coordinador, Dirección y RH, pero el backend mantiene 403 como autoridad.</w:t>
+      </w:r>
+    </w:p>
+    <w:p>
+      <w:pPr>
+        <w:spacing w:after="100"/>
+      </w:pPr>
+      <w:r>
+        <w:rPr>
+          <w:rFonts w:ascii="Aptos" w:hAnsi="Aptos"/>
+          <w:b w:val="0"/>
+          <w:color w:val="334155"/>
+          <w:sz w:val="18"/>
+        </w:rPr>
+        <w:t>Contrato técnico:</w:t>
+      </w:r>
+    </w:p>
+    <w:p>
+      <w:pPr>
+        <w:spacing w:after="40"/>
+      </w:pPr>
+      <w:r>
+        <w:rPr>
+          <w:rFonts w:ascii="Aptos" w:hAnsi="Aptos"/>
+          <w:b w:val="0"/>
+          <w:color w:val="334155"/>
+          <w:sz w:val="18"/>
+        </w:rPr>
+        <w:t>• template blank, active o all, con diez columnas operativas exactas;</w:t>
+      </w:r>
+    </w:p>
+    <w:p>
+      <w:pPr>
+        <w:spacing w:after="40"/>
+      </w:pPr>
+      <w:r>
+        <w:rPr>
+          <w:rFonts w:ascii="Aptos" w:hAnsi="Aptos"/>
+          <w:b w:val="0"/>
+          <w:color w:val="334155"/>
+          <w:sz w:val="18"/>
+        </w:rPr>
+        <w:t>• Preview parsea de nuevo, valida UUID/identificador/nombre, responsables,</w:t>
+      </w:r>
+    </w:p>
+    <w:p>
+      <w:pPr>
+        <w:spacing w:after="100"/>
+      </w:pPr>
+      <w:r>
+        <w:rPr>
+          <w:rFonts w:ascii="Aptos" w:hAnsi="Aptos"/>
+          <w:b w:val="0"/>
+          <w:color w:val="334155"/>
+          <w:sz w:val="18"/>
+        </w:rPr>
+        <w:t xml:space="preserve">  dependencias, acciones y riesgos, sin escribir ni auditar;</w:t>
+      </w:r>
+    </w:p>
+    <w:p>
+      <w:pPr>
+        <w:spacing w:after="40"/>
+      </w:pPr>
+      <w:r>
+        <w:rPr>
+          <w:rFonts w:ascii="Aptos" w:hAnsi="Aptos"/>
+          <w:b w:val="0"/>
+          <w:color w:val="334155"/>
+          <w:sz w:val="18"/>
+        </w:rPr>
+        <w:t>• Apply recibe archivo y fingerprints, pero no confía en acciones calculadas</w:t>
+      </w:r>
+    </w:p>
+    <w:p>
+      <w:pPr>
+        <w:spacing w:after="100"/>
+      </w:pPr>
+      <w:r>
+        <w:rPr>
+          <w:rFonts w:ascii="Aptos" w:hAnsi="Aptos"/>
+          <w:b w:val="0"/>
+          <w:color w:val="334155"/>
+          <w:sz w:val="18"/>
+        </w:rPr>
+        <w:t xml:space="preserve">  por el cliente;</w:t>
+      </w:r>
+    </w:p>
+    <w:p>
+      <w:pPr>
+        <w:spacing w:after="40"/>
+      </w:pPr>
+      <w:r>
+        <w:rPr>
+          <w:rFonts w:ascii="Aptos" w:hAnsi="Aptos"/>
+          <w:b w:val="0"/>
+          <w:color w:val="334155"/>
+          <w:sz w:val="18"/>
+        </w:rPr>
+        <w:t>• advisory lock serializa importaciones;</w:t>
+      </w:r>
+    </w:p>
+    <w:p>
+      <w:pPr>
+        <w:spacing w:after="40"/>
+      </w:pPr>
+      <w:r>
+        <w:rPr>
+          <w:rFonts w:ascii="Aptos" w:hAnsi="Aptos"/>
+          <w:b w:val="0"/>
+          <w:color w:val="334155"/>
+          <w:sz w:val="18"/>
+        </w:rPr>
+        <w:t>• SELECT ... FOR UPDATE y fingerprints detectan concurrencia;</w:t>
+      </w:r>
+    </w:p>
+    <w:p>
+      <w:pPr>
+        <w:spacing w:after="40"/>
+      </w:pPr>
+      <w:r>
+        <w:rPr>
+          <w:rFonts w:ascii="Aptos" w:hAnsi="Aptos"/>
+          <w:b w:val="0"/>
+          <w:color w:val="334155"/>
+          <w:sz w:val="18"/>
+        </w:rPr>
+        <w:t>• una sola transacción garantiza atomicidad;</w:t>
+      </w:r>
+    </w:p>
+    <w:p>
+      <w:pPr>
+        <w:spacing w:after="40"/>
+      </w:pPr>
+      <w:r>
+        <w:rPr>
+          <w:rFonts w:ascii="Aptos" w:hAnsi="Aptos"/>
+          <w:b w:val="0"/>
+          <w:color w:val="334155"/>
+          <w:sz w:val="18"/>
+        </w:rPr>
+        <w:t>• PostgreSQL conserva autoridad final y 23505 se traduce a conflicto seguro;</w:t>
+      </w:r>
+    </w:p>
+    <w:p>
+      <w:pPr>
+        <w:spacing w:after="40"/>
+      </w:pPr>
+      <w:r>
+        <w:rPr>
+          <w:rFonts w:ascii="Aptos" w:hAnsi="Aptos"/>
+          <w:b w:val="0"/>
+          <w:color w:val="334155"/>
+          <w:sz w:val="18"/>
+        </w:rPr>
+        <w:t>• auditoría registra resumen y cambios operativos, nunca CSV/Base64 ni fiscales.</w:t>
+      </w:r>
+    </w:p>
+    <w:p>
+      <w:pPr>
+        <w:spacing w:after="100"/>
+      </w:pPr>
+      <w:r>
+        <w:rPr>
+          <w:rFonts w:ascii="Aptos" w:hAnsi="Aptos"/>
+          <w:b w:val="0"/>
+          <w:color w:val="334155"/>
+          <w:sz w:val="18"/>
+        </w:rPr>
+        <w:t>La migración:</w:t>
+      </w:r>
+    </w:p>
+    <w:p>
+      <w:pPr>
+        <w:keepNext/>
+      </w:pPr>
+      <w:r>
+        <w:rPr>
+          <w:rFonts w:ascii="Aptos" w:hAnsi="Aptos"/>
+          <w:b/>
+          <w:color w:val="0F766E"/>
+          <w:sz w:val="17"/>
+        </w:rPr>
+        <w:t>Bloque técnico</w:t>
+      </w:r>
+    </w:p>
+    <w:p>
+      <w:pPr>
+        <w:spacing w:after="0"/>
+        <w:ind w:left="317"/>
+      </w:pPr>
+      <w:r>
+        <w:rPr>
+          <w:rFonts w:ascii="Consolas" w:hAnsi="Consolas"/>
+          <w:color w:val="334155"/>
+          <w:sz w:val="15"/>
+        </w:rPr>
+        <w:t>014_h22_teacher_external_identifier_unique.sql</w:t>
+      </w:r>
+    </w:p>
+    <w:p>
+      <w:pPr>
+        <w:spacing w:after="100"/>
+      </w:pPr>
+      <w:r>
+        <w:rPr>
+          <w:rFonts w:ascii="Aptos" w:hAnsi="Aptos"/>
+          <w:b w:val="0"/>
+          <w:color w:val="334155"/>
+          <w:sz w:val="18"/>
+        </w:rPr>
+        <w:t>crea el índice único parcial</w:t>
+      </w:r>
+    </w:p>
+    <w:p>
+      <w:pPr>
+        <w:spacing w:after="100"/>
+      </w:pPr>
+      <w:r>
+        <w:rPr>
+          <w:rFonts w:ascii="Aptos" w:hAnsi="Aptos"/>
+          <w:b w:val="0"/>
+          <w:color w:val="334155"/>
+          <w:sz w:val="18"/>
+        </w:rPr>
+        <w:t>teachers_external_identifier_unique_idx sobre</w:t>
+      </w:r>
+    </w:p>
+    <w:p>
+      <w:pPr>
+        <w:spacing w:after="100"/>
+      </w:pPr>
+      <w:r>
+        <w:rPr>
+          <w:rFonts w:ascii="Aptos" w:hAnsi="Aptos"/>
+          <w:b w:val="0"/>
+          <w:color w:val="334155"/>
+          <w:sz w:val="18"/>
+        </w:rPr>
+        <w:t>upper(btrim(external_identifier)), excluyendo vacíos. No contiene DML ni</w:t>
+      </w:r>
+    </w:p>
+    <w:p>
+      <w:pPr>
+        <w:spacing w:after="100"/>
+      </w:pPr>
+      <w:r>
+        <w:rPr>
+          <w:rFonts w:ascii="Aptos" w:hAnsi="Aptos"/>
+          <w:b w:val="0"/>
+          <w:color w:val="334155"/>
+          <w:sz w:val="18"/>
+        </w:rPr>
+        <w:t>modifica filas.</w:t>
+      </w:r>
+    </w:p>
+    <w:p>
+      <w:pPr>
+        <w:spacing w:after="100"/>
+      </w:pPr>
+      <w:r>
+        <w:rPr>
+          <w:rFonts w:ascii="Aptos" w:hAnsi="Aptos"/>
+          <w:b w:val="0"/>
+          <w:color w:val="334155"/>
+          <w:sz w:val="18"/>
+        </w:rPr>
+        <w:t>Nombres legacy:</w:t>
+      </w:r>
+    </w:p>
+    <w:p>
+      <w:pPr>
+        <w:spacing w:after="40"/>
+      </w:pPr>
+      <w:r>
+        <w:rPr>
+          <w:rFonts w:ascii="Aptos" w:hAnsi="Aptos"/>
+          <w:b w:val="0"/>
+          <w:color w:val="334155"/>
+          <w:sz w:val="18"/>
+        </w:rPr>
+        <w:t>• si no hay cambio nominal, se conservan full_name y normalized_name;</w:t>
+      </w:r>
+    </w:p>
+    <w:p>
+      <w:pPr>
+        <w:spacing w:after="40"/>
+      </w:pPr>
+      <w:r>
+        <w:rPr>
+          <w:rFonts w:ascii="Aptos" w:hAnsi="Aptos"/>
+          <w:b w:val="0"/>
+          <w:color w:val="334155"/>
+          <w:sz w:val="18"/>
+        </w:rPr>
+        <w:t>• un cambio operativo no reconstruye nombres con componentes vacíos;</w:t>
+      </w:r>
+    </w:p>
+    <w:p>
+      <w:pPr>
+        <w:spacing w:after="40"/>
+      </w:pPr>
+      <w:r>
+        <w:rPr>
+          <w:rFonts w:ascii="Aptos" w:hAnsi="Aptos"/>
+          <w:b w:val="0"/>
+          <w:color w:val="334155"/>
+          <w:sz w:val="18"/>
+        </w:rPr>
+        <w:t>• un cambio nominal explícito usa los componentes efectivos y vuelve a validar</w:t>
+      </w:r>
+    </w:p>
+    <w:p>
+      <w:pPr>
+        <w:spacing w:after="100"/>
+      </w:pPr>
+      <w:r>
+        <w:rPr>
+          <w:rFonts w:ascii="Aptos" w:hAnsi="Aptos"/>
+          <w:b w:val="0"/>
+          <w:color w:val="334155"/>
+          <w:sz w:val="18"/>
+        </w:rPr>
+        <w:t xml:space="preserve">  unicidad;</w:t>
+      </w:r>
+    </w:p>
+    <w:p>
+      <w:pPr>
+        <w:spacing w:after="40"/>
+      </w:pPr>
+      <w:r>
+        <w:rPr>
+          <w:rFonts w:ascii="Aptos" w:hAnsi="Aptos"/>
+          <w:b w:val="0"/>
+          <w:color w:val="334155"/>
+          <w:sz w:val="18"/>
+        </w:rPr>
+        <w:t>• una fila SIN_CAMBIOS no ejecuta UPDATE ni genera auditoría por docente.</w:t>
+      </w:r>
+    </w:p>
+    <w:p>
+      <w:pPr>
+        <w:spacing w:after="100"/>
+      </w:pPr>
+      <w:r>
+        <w:rPr>
+          <w:rFonts w:ascii="Aptos" w:hAnsi="Aptos"/>
+          <w:b w:val="0"/>
+          <w:color w:val="334155"/>
+          <w:sz w:val="18"/>
+        </w:rPr>
+        <w:t>Datos excluidos:</w:t>
+      </w:r>
+    </w:p>
+    <w:p>
+      <w:pPr>
+        <w:spacing w:after="40"/>
+      </w:pPr>
+      <w:r>
+        <w:rPr>
+          <w:rFonts w:ascii="Aptos" w:hAnsi="Aptos"/>
+          <w:b w:val="0"/>
+          <w:color w:val="334155"/>
+          <w:sz w:val="18"/>
+        </w:rPr>
+        <w:t>• RFC;</w:t>
+      </w:r>
+    </w:p>
+    <w:p>
+      <w:pPr>
+        <w:spacing w:after="40"/>
+      </w:pPr>
+      <w:r>
+        <w:rPr>
+          <w:rFonts w:ascii="Aptos" w:hAnsi="Aptos"/>
+          <w:b w:val="0"/>
+          <w:color w:val="334155"/>
+          <w:sz w:val="18"/>
+        </w:rPr>
+        <w:t>• banco, cuenta y CLABE;</w:t>
+      </w:r>
+    </w:p>
+    <w:p>
+      <w:pPr>
+        <w:spacing w:after="40"/>
+      </w:pPr>
+      <w:r>
+        <w:rPr>
+          <w:rFonts w:ascii="Aptos" w:hAnsi="Aptos"/>
+          <w:b w:val="0"/>
+          <w:color w:val="334155"/>
+          <w:sz w:val="18"/>
+        </w:rPr>
+        <w:t>• correo o expediente fiscal;</w:t>
+      </w:r>
+    </w:p>
+    <w:p>
+      <w:pPr>
+        <w:spacing w:after="40"/>
+      </w:pPr>
+      <w:r>
+        <w:rPr>
+          <w:rFonts w:ascii="Aptos" w:hAnsi="Aptos"/>
+          <w:b w:val="0"/>
+          <w:color w:val="334155"/>
+          <w:sz w:val="18"/>
+        </w:rPr>
+        <w:t>• tipo de pago;</w:t>
+      </w:r>
+    </w:p>
+    <w:p>
+      <w:pPr>
+        <w:spacing w:after="40"/>
+      </w:pPr>
+      <w:r>
+        <w:rPr>
+          <w:rFonts w:ascii="Aptos" w:hAnsi="Aptos"/>
+          <w:b w:val="0"/>
+          <w:color w:val="334155"/>
+          <w:sz w:val="18"/>
+        </w:rPr>
+        <w:t>• constancias;</w:t>
+      </w:r>
+    </w:p>
+    <w:p>
+      <w:pPr>
+        <w:spacing w:after="40"/>
+      </w:pPr>
+      <w:r>
+        <w:rPr>
+          <w:rFonts w:ascii="Aptos" w:hAnsi="Aptos"/>
+          <w:b w:val="0"/>
+          <w:color w:val="334155"/>
+          <w:sz w:val="18"/>
+        </w:rPr>
+        <w:t>• nómina, corridas y snapshots.</w:t>
+      </w:r>
+    </w:p>
+    <w:p>
+      <w:pPr>
+        <w:spacing w:after="100"/>
+      </w:pPr>
+      <w:r>
+        <w:rPr>
+          <w:rFonts w:ascii="Aptos" w:hAnsi="Aptos"/>
+          <w:b w:val="0"/>
+          <w:color w:val="334155"/>
+          <w:sz w:val="18"/>
+        </w:rPr>
+        <w:t>Pruebas predeploy posteriores a los fixes: API 27/27, web 79/79, integración</w:t>
+      </w:r>
+    </w:p>
+    <w:p>
+      <w:pPr>
+        <w:spacing w:after="100"/>
+      </w:pPr>
+      <w:r>
+        <w:rPr>
+          <w:rFonts w:ascii="Aptos" w:hAnsi="Aptos"/>
+          <w:b w:val="0"/>
+          <w:color w:val="334155"/>
+          <w:sz w:val="18"/>
+        </w:rPr>
+        <w:t>PostgreSQL 105/105, prueba focal del panel 11/11, typecheck y build OK.</w:t>
+      </w:r>
+    </w:p>
+    <w:p>
+      <w:pPr>
+        <w:pStyle w:val="Heading2"/>
+      </w:pPr>
+      <w:r>
         <w:t>6.4 Directorio Docente</w:t>
       </w:r>
     </w:p>
@@ -15770,6 +16380,280 @@
     </w:p>
     <w:p>
       <w:pPr>
+        <w:pStyle w:val="Heading2"/>
+      </w:pPr>
+      <w:r>
+        <w:t>12.5 Plan de despliegue H22</w:t>
+      </w:r>
+    </w:p>
+    <w:p>
+      <w:pPr>
+        <w:spacing w:after="100"/>
+      </w:pPr>
+      <w:r>
+        <w:rPr>
+          <w:rFonts w:ascii="Aptos" w:hAnsi="Aptos"/>
+          <w:b w:val="0"/>
+          <w:color w:val="334155"/>
+          <w:sz w:val="18"/>
+        </w:rPr>
+        <w:t>H22-F5 debe ejecutarse como ventana controlada:</w:t>
+      </w:r>
+    </w:p>
+    <w:p>
+      <w:pPr>
+        <w:spacing w:after="40"/>
+      </w:pPr>
+      <w:r>
+        <w:rPr>
+          <w:rFonts w:ascii="Aptos" w:hAnsi="Aptos"/>
+          <w:b w:val="0"/>
+          <w:color w:val="334155"/>
+          <w:sz w:val="18"/>
+        </w:rPr>
+        <w:t>1. Confirmar rama/SHA, árbol limpio, smoke humano F4 y suites verdes.</w:t>
+      </w:r>
+    </w:p>
+    <w:p>
+      <w:pPr>
+        <w:spacing w:after="40"/>
+      </w:pPr>
+      <w:r>
+        <w:rPr>
+          <w:rFonts w:ascii="Aptos" w:hAnsi="Aptos"/>
+          <w:b w:val="0"/>
+          <w:color w:val="334155"/>
+          <w:sz w:val="18"/>
+        </w:rPr>
+        <w:t>2. Confirmar npm audit con cero vulnerabilidades críticas.</w:t>
+      </w:r>
+    </w:p>
+    <w:p>
+      <w:pPr>
+        <w:spacing w:after="40"/>
+      </w:pPr>
+      <w:r>
+        <w:rPr>
+          <w:rFonts w:ascii="Aptos" w:hAnsi="Aptos"/>
+          <w:b w:val="0"/>
+          <w:color w:val="334155"/>
+          <w:sz w:val="18"/>
+        </w:rPr>
+        <w:t>3. Ejecutar H05 productivo read-only y validar pendiente exacta 014.</w:t>
+      </w:r>
+    </w:p>
+    <w:p>
+      <w:pPr>
+        <w:spacing w:after="40"/>
+      </w:pPr>
+      <w:r>
+        <w:rPr>
+          <w:rFonts w:ascii="Aptos" w:hAnsi="Aptos"/>
+          <w:b w:val="0"/>
+          <w:color w:val="334155"/>
+          <w:sz w:val="18"/>
+        </w:rPr>
+        <w:t>4. Crear backup on-demand y esperar SUCCESSFUL.</w:t>
+      </w:r>
+    </w:p>
+    <w:p>
+      <w:pPr>
+        <w:spacing w:after="40"/>
+      </w:pPr>
+      <w:r>
+        <w:rPr>
+          <w:rFonts w:ascii="Aptos" w:hAnsi="Aptos"/>
+          <w:b w:val="0"/>
+          <w:color w:val="334155"/>
+          <w:sz w:val="18"/>
+        </w:rPr>
+        <w:t>5. Registrar conteos y fingerprints previos.</w:t>
+      </w:r>
+    </w:p>
+    <w:p>
+      <w:pPr>
+        <w:spacing w:after="40"/>
+      </w:pPr>
+      <w:r>
+        <w:rPr>
+          <w:rFonts w:ascii="Aptos" w:hAnsi="Aptos"/>
+          <w:b w:val="0"/>
+          <w:color w:val="334155"/>
+          <w:sz w:val="18"/>
+        </w:rPr>
+        <w:t>6. Aplicar 014 únicamente mediante H05.</w:t>
+      </w:r>
+    </w:p>
+    <w:p>
+      <w:pPr>
+        <w:spacing w:after="40"/>
+      </w:pPr>
+      <w:r>
+        <w:rPr>
+          <w:rFonts w:ascii="Aptos" w:hAnsi="Aptos"/>
+          <w:b w:val="0"/>
+          <w:color w:val="334155"/>
+          <w:sz w:val="18"/>
+        </w:rPr>
+        <w:t>7. Confirmar pending=0 y checksum mismatch=0.</w:t>
+      </w:r>
+    </w:p>
+    <w:p>
+      <w:pPr>
+        <w:spacing w:after="40"/>
+      </w:pPr>
+      <w:r>
+        <w:rPr>
+          <w:rFonts w:ascii="Aptos" w:hAnsi="Aptos"/>
+          <w:b w:val="0"/>
+          <w:color w:val="334155"/>
+          <w:sz w:val="18"/>
+        </w:rPr>
+        <w:t>8. Desplegar API y Firebase Hosting sin cambiar variables, secretos, CORS,</w:t>
+      </w:r>
+    </w:p>
+    <w:p>
+      <w:pPr>
+        <w:spacing w:after="100"/>
+      </w:pPr>
+      <w:r>
+        <w:rPr>
+          <w:rFonts w:ascii="Aptos" w:hAnsi="Aptos"/>
+          <w:b w:val="0"/>
+          <w:color w:val="334155"/>
+          <w:sz w:val="18"/>
+        </w:rPr>
+        <w:t xml:space="preserve">   service account o permisos.</w:t>
+      </w:r>
+    </w:p>
+    <w:p>
+      <w:pPr>
+        <w:spacing w:after="40"/>
+      </w:pPr>
+      <w:r>
+        <w:rPr>
+          <w:rFonts w:ascii="Aptos" w:hAnsi="Aptos"/>
+          <w:b w:val="0"/>
+          <w:color w:val="334155"/>
+          <w:sz w:val="18"/>
+        </w:rPr>
+        <w:t>9. Ejecutar healthchecks, revisar logs y realizar smoke Admin/no Admin.</w:t>
+      </w:r>
+    </w:p>
+    <w:p>
+      <w:pPr>
+        <w:spacing w:after="40"/>
+      </w:pPr>
+      <w:r>
+        <w:rPr>
+          <w:rFonts w:ascii="Aptos" w:hAnsi="Aptos"/>
+          <w:b w:val="0"/>
+          <w:color w:val="334155"/>
+          <w:sz w:val="18"/>
+        </w:rPr>
+        <w:t>10. Descargar plantillas y ejecutar Preview; no ejecutar Apply institucional.</w:t>
+      </w:r>
+    </w:p>
+    <w:p>
+      <w:pPr>
+        <w:spacing w:after="40"/>
+      </w:pPr>
+      <w:r>
+        <w:rPr>
+          <w:rFonts w:ascii="Aptos" w:hAnsi="Aptos"/>
+          <w:b w:val="0"/>
+          <w:color w:val="334155"/>
+          <w:sz w:val="18"/>
+        </w:rPr>
+        <w:t>11. Cambiar los manuales de “preparada” a “disponible en producción”.</w:t>
+      </w:r>
+    </w:p>
+    <w:p>
+      <w:pPr>
+        <w:spacing w:after="100"/>
+      </w:pPr>
+      <w:r>
+        <w:rPr>
+          <w:rFonts w:ascii="Aptos" w:hAnsi="Aptos"/>
+          <w:b w:val="0"/>
+          <w:color w:val="334155"/>
+          <w:sz w:val="18"/>
+        </w:rPr>
+        <w:t>Rollback:</w:t>
+      </w:r>
+    </w:p>
+    <w:p>
+      <w:pPr>
+        <w:spacing w:after="40"/>
+      </w:pPr>
+      <w:r>
+        <w:rPr>
+          <w:rFonts w:ascii="Aptos" w:hAnsi="Aptos"/>
+          <w:b w:val="0"/>
+          <w:color w:val="334155"/>
+          <w:sz w:val="18"/>
+        </w:rPr>
+        <w:t>• API: regresar tráfico a la revisión anterior.</w:t>
+      </w:r>
+    </w:p>
+    <w:p>
+      <w:pPr>
+        <w:spacing w:after="40"/>
+      </w:pPr>
+      <w:r>
+        <w:rPr>
+          <w:rFonts w:ascii="Aptos" w:hAnsi="Aptos"/>
+          <w:b w:val="0"/>
+          <w:color w:val="334155"/>
+          <w:sz w:val="18"/>
+        </w:rPr>
+        <w:t>• Hosting: restaurar el release anterior.</w:t>
+      </w:r>
+    </w:p>
+    <w:p>
+      <w:pPr>
+        <w:spacing w:after="40"/>
+      </w:pPr>
+      <w:r>
+        <w:rPr>
+          <w:rFonts w:ascii="Aptos" w:hAnsi="Aptos"/>
+          <w:b w:val="0"/>
+          <w:color w:val="334155"/>
+          <w:sz w:val="18"/>
+        </w:rPr>
+        <w:t>• Si solo falla UI/API, conservar el índice 014.</w:t>
+      </w:r>
+    </w:p>
+    <w:p>
+      <w:pPr>
+        <w:spacing w:after="40"/>
+      </w:pPr>
+      <w:r>
+        <w:rPr>
+          <w:rFonts w:ascii="Aptos" w:hAnsi="Aptos"/>
+          <w:b w:val="0"/>
+          <w:color w:val="334155"/>
+          <w:sz w:val="18"/>
+        </w:rPr>
+        <w:t>• No eliminar el índice improvisadamente.</w:t>
+      </w:r>
+    </w:p>
+    <w:p>
+      <w:pPr>
+        <w:spacing w:after="40"/>
+      </w:pPr>
+      <w:r>
+        <w:rPr>
+          <w:rFonts w:ascii="Aptos" w:hAnsi="Aptos"/>
+          <w:b w:val="0"/>
+          <w:color w:val="334155"/>
+          <w:sz w:val="18"/>
+        </w:rPr>
+        <w:t>• Restaurar backup solo mediante procedimiento DBA aprobado.</w:t>
+      </w:r>
+    </w:p>
+    <w:p>
+      <w:pPr>
         <w:pStyle w:val="Heading1"/>
       </w:pPr>
       <w:r>
@@ -15999,6 +16883,48 @@
           <w:sz w:val="18"/>
         </w:rPr>
         <w:t>• Rollback API: devolver tráfico a la revisión anterior documentada. Rollback Hosting: restaurar el release anterior. H20 no tiene migración de BD que revertir.</w:t>
+      </w:r>
+    </w:p>
+    <w:p>
+      <w:pPr>
+        <w:spacing w:after="40"/>
+      </w:pPr>
+      <w:r>
+        <w:rPr>
+          <w:rFonts w:ascii="Aptos" w:hAnsi="Aptos"/>
+          <w:b w:val="0"/>
+          <w:color w:val="334155"/>
+          <w:sz w:val="18"/>
+        </w:rPr>
+        <w:t>• Para H22, no ejecutar Apply institucional durante el smoke de deploy; la</w:t>
+      </w:r>
+    </w:p>
+    <w:p>
+      <w:pPr>
+        <w:spacing w:after="100"/>
+      </w:pPr>
+      <w:r>
+        <w:rPr>
+          <w:rFonts w:ascii="Aptos" w:hAnsi="Aptos"/>
+          <w:b w:val="0"/>
+          <w:color w:val="334155"/>
+          <w:sz w:val="18"/>
+        </w:rPr>
+        <w:t xml:space="preserve">  migración 014 debe aplicarse por H05 y conservarse si el incidente es solo</w:t>
+      </w:r>
+    </w:p>
+    <w:p>
+      <w:pPr>
+        <w:spacing w:after="100"/>
+      </w:pPr>
+      <w:r>
+        <w:rPr>
+          <w:rFonts w:ascii="Aptos" w:hAnsi="Aptos"/>
+          <w:b w:val="0"/>
+          <w:color w:val="334155"/>
+          <w:sz w:val="18"/>
+        </w:rPr>
+        <w:t xml:space="preserve">  de API/UI.</w:t>
       </w:r>
     </w:p>
     <w:p>

</xml_diff>

<commit_message>
docs(h22): record teacher import production deploy
</commit_message>
<xml_diff>
--- a/docs/Manual_Entrega_Nomina_Docente.docx
+++ b/docs/Manual_Entrega_Nomina_Docente.docx
@@ -2257,7 +2257,63 @@
           <w:color w:val="334155"/>
           <w:sz w:val="18"/>
         </w:rPr>
-        <w:t>Estado productivo verificado el 2026-07-18: revisión Cloud Run nomina-api-00051-9s5, imagen h20-prod-56553f4, Firebase Hosting release 1784228039752000 y version 41bf160c7c3595b6.</w:t>
+        <w:t>Estado productivo verificado el 2026-07-31: revisión Cloud Run</w:t>
+      </w:r>
+    </w:p>
+    <w:p>
+      <w:pPr>
+        <w:spacing w:after="100"/>
+      </w:pPr>
+      <w:r>
+        <w:rPr>
+          <w:rFonts w:ascii="Aptos" w:hAnsi="Aptos"/>
+          <w:b w:val="0"/>
+          <w:color w:val="334155"/>
+          <w:sz w:val="18"/>
+        </w:rPr>
+        <w:t>nomina-api-00053-cjg, imagen h22-prod-030ae69, digest</w:t>
+      </w:r>
+    </w:p>
+    <w:p>
+      <w:pPr>
+        <w:spacing w:after="100"/>
+      </w:pPr>
+      <w:r>
+        <w:rPr>
+          <w:rFonts w:ascii="Aptos" w:hAnsi="Aptos"/>
+          <w:b w:val="0"/>
+          <w:color w:val="334155"/>
+          <w:sz w:val="18"/>
+        </w:rPr>
+        <w:t>sha256:8e184919579d73fcfc1ecc3b1884edd5da40bc83891d5407d4cc7be95d215028,</w:t>
+      </w:r>
+    </w:p>
+    <w:p>
+      <w:pPr>
+        <w:spacing w:after="100"/>
+      </w:pPr>
+      <w:r>
+        <w:rPr>
+          <w:rFonts w:ascii="Aptos" w:hAnsi="Aptos"/>
+          <w:b w:val="0"/>
+          <w:color w:val="334155"/>
+          <w:sz w:val="18"/>
+        </w:rPr>
+        <w:t>Firebase Hosting release 1785457082597000 y version</w:t>
+      </w:r>
+    </w:p>
+    <w:p>
+      <w:pPr>
+        <w:spacing w:after="100"/>
+      </w:pPr>
+      <w:r>
+        <w:rPr>
+          <w:rFonts w:ascii="Aptos" w:hAnsi="Aptos"/>
+          <w:b w:val="0"/>
+          <w:color w:val="334155"/>
+          <w:sz w:val="18"/>
+        </w:rPr>
+        <w:t>466c8eb59d99c2dd.</w:t>
       </w:r>
     </w:p>
     <w:p>
@@ -7077,7 +7133,7 @@
           <w:color w:val="334155"/>
           <w:sz w:val="18"/>
         </w:rPr>
-        <w:t>Estado predeploy: preparada para el siguiente despliegue productivo H22.</w:t>
+        <w:t>Estado productivo: H22 cerrado operativo. La migración 014, API/Hosting</w:t>
       </w:r>
     </w:p>
     <w:p>
@@ -7091,7 +7147,21 @@
           <w:color w:val="334155"/>
           <w:sz w:val="18"/>
         </w:rPr>
-        <w:t>La migración 014, API/Hosting y el smoke productivo permanecen pendientes.</w:t>
+        <w:t>y el smoke autenticado fueron aprobados. No se ejecutó Apply ni se aplicó un</w:t>
+      </w:r>
+    </w:p>
+    <w:p>
+      <w:pPr>
+        <w:spacing w:after="100"/>
+      </w:pPr>
+      <w:r>
+        <w:rPr>
+          <w:rFonts w:ascii="Aptos" w:hAnsi="Aptos"/>
+          <w:b w:val="0"/>
+          <w:color w:val="334155"/>
+          <w:sz w:val="18"/>
+        </w:rPr>
+        <w:t>CSV institucional durante el deploy.</w:t>
       </w:r>
     </w:p>
     <w:p>
@@ -16383,7 +16453,7 @@
         <w:pStyle w:val="Heading2"/>
       </w:pPr>
       <w:r>
-        <w:t>12.5 Plan de despliegue H22</w:t>
+        <w:t>12.5 Resultado del despliegue H22</w:t>
       </w:r>
     </w:p>
     <w:p>
@@ -16397,7 +16467,7 @@
           <w:color w:val="334155"/>
           <w:sz w:val="18"/>
         </w:rPr>
-        <w:t>H22-F5 debe ejecutarse como ventana controlada:</w:t>
+        <w:t>H22-F5 se ejecutó como ventana controlada:</w:t>
       </w:r>
     </w:p>
     <w:p>
@@ -16411,7 +16481,7 @@
           <w:color w:val="334155"/>
           <w:sz w:val="18"/>
         </w:rPr>
-        <w:t>1. Confirmar rama/SHA, árbol limpio, smoke humano F4 y suites verdes.</w:t>
+        <w:t>1. Backup 1785456525085, estado SUCCESSFUL.</w:t>
       </w:r>
     </w:p>
     <w:p>
@@ -16425,7 +16495,7 @@
           <w:color w:val="334155"/>
           <w:sz w:val="18"/>
         </w:rPr>
-        <w:t>2. Confirmar npm audit con cero vulnerabilidades críticas.</w:t>
+        <w:t>2. 014 aplicada exclusivamente mediante H05.</w:t>
       </w:r>
     </w:p>
     <w:p>
@@ -16439,7 +16509,21 @@
           <w:color w:val="334155"/>
           <w:sz w:val="18"/>
         </w:rPr>
-        <w:t>3. Ejecutar H05 productivo read-only y validar pendiente exacta 014.</w:t>
+        <w:t>3. H05 final: 17 registradas, 15 baseline, 013/014 aplicadas,</w:t>
+      </w:r>
+    </w:p>
+    <w:p>
+      <w:pPr>
+        <w:spacing w:after="100"/>
+      </w:pPr>
+      <w:r>
+        <w:rPr>
+          <w:rFonts w:ascii="Aptos" w:hAnsi="Aptos"/>
+          <w:b w:val="0"/>
+          <w:color w:val="334155"/>
+          <w:sz w:val="18"/>
+        </w:rPr>
+        <w:t xml:space="preserve">   pending=0 y checksum mismatch=0.</w:t>
       </w:r>
     </w:p>
     <w:p>
@@ -16453,7 +16537,7 @@
           <w:color w:val="334155"/>
           <w:sz w:val="18"/>
         </w:rPr>
-        <w:t>4. Crear backup on-demand y esperar SUCCESSFUL.</w:t>
+        <w:t>4. API desplegada en nomina-api-00053-cjg, 100% del tráfico.</w:t>
       </w:r>
     </w:p>
     <w:p>
@@ -16467,7 +16551,21 @@
           <w:color w:val="334155"/>
           <w:sz w:val="18"/>
         </w:rPr>
-        <w:t>5. Registrar conteos y fingerprints previos.</w:t>
+        <w:t>5. Hosting live release 1785457082597000, version</w:t>
+      </w:r>
+    </w:p>
+    <w:p>
+      <w:pPr>
+        <w:spacing w:after="100"/>
+      </w:pPr>
+      <w:r>
+        <w:rPr>
+          <w:rFonts w:ascii="Aptos" w:hAnsi="Aptos"/>
+          <w:b w:val="0"/>
+          <w:color w:val="334155"/>
+          <w:sz w:val="18"/>
+        </w:rPr>
+        <w:t xml:space="preserve">   466c8eb59d99c2dd.</w:t>
       </w:r>
     </w:p>
     <w:p>
@@ -16481,7 +16579,7 @@
           <w:color w:val="334155"/>
           <w:sz w:val="18"/>
         </w:rPr>
-        <w:t>6. Aplicar 014 únicamente mediante H05.</w:t>
+        <w:t>6. Healthchecks HTTP 200 y rutas protegidas sin sesión HTTP 401 esperado.</w:t>
       </w:r>
     </w:p>
     <w:p>
@@ -16495,7 +16593,7 @@
           <w:color w:val="334155"/>
           <w:sz w:val="18"/>
         </w:rPr>
-        <w:t>7. Confirmar pending=0 y checksum mismatch=0.</w:t>
+        <w:t>7. Smoke Admin/no Admin y responsive aprobado por el usuario.</w:t>
       </w:r>
     </w:p>
     <w:p>
@@ -16509,63 +16607,7 @@
           <w:color w:val="334155"/>
           <w:sz w:val="18"/>
         </w:rPr>
-        <w:t>8. Desplegar API y Firebase Hosting sin cambiar variables, secretos, CORS,</w:t>
-      </w:r>
-    </w:p>
-    <w:p>
-      <w:pPr>
-        <w:spacing w:after="100"/>
-      </w:pPr>
-      <w:r>
-        <w:rPr>
-          <w:rFonts w:ascii="Aptos" w:hAnsi="Aptos"/>
-          <w:b w:val="0"/>
-          <w:color w:val="334155"/>
-          <w:sz w:val="18"/>
-        </w:rPr>
-        <w:t xml:space="preserve">   service account o permisos.</w:t>
-      </w:r>
-    </w:p>
-    <w:p>
-      <w:pPr>
-        <w:spacing w:after="40"/>
-      </w:pPr>
-      <w:r>
-        <w:rPr>
-          <w:rFonts w:ascii="Aptos" w:hAnsi="Aptos"/>
-          <w:b w:val="0"/>
-          <w:color w:val="334155"/>
-          <w:sz w:val="18"/>
-        </w:rPr>
-        <w:t>9. Ejecutar healthchecks, revisar logs y realizar smoke Admin/no Admin.</w:t>
-      </w:r>
-    </w:p>
-    <w:p>
-      <w:pPr>
-        <w:spacing w:after="40"/>
-      </w:pPr>
-      <w:r>
-        <w:rPr>
-          <w:rFonts w:ascii="Aptos" w:hAnsi="Aptos"/>
-          <w:b w:val="0"/>
-          <w:color w:val="334155"/>
-          <w:sz w:val="18"/>
-        </w:rPr>
-        <w:t>10. Descargar plantillas y ejecutar Preview; no ejecutar Apply institucional.</w:t>
-      </w:r>
-    </w:p>
-    <w:p>
-      <w:pPr>
-        <w:spacing w:after="40"/>
-      </w:pPr>
-      <w:r>
-        <w:rPr>
-          <w:rFonts w:ascii="Aptos" w:hAnsi="Aptos"/>
-          <w:b w:val="0"/>
-          <w:color w:val="334155"/>
-          <w:sz w:val="18"/>
-        </w:rPr>
-        <w:t>11. Cambiar los manuales de “preparada” a “disponible en producción”.</w:t>
+        <w:t>8. Plantillas y Preview validados; no se ejecutó Apply institucional.</w:t>
       </w:r>
     </w:p>
     <w:p>
@@ -16896,7 +16938,7 @@
           <w:color w:val="334155"/>
           <w:sz w:val="18"/>
         </w:rPr>
-        <w:t>• Para H22, no ejecutar Apply institucional durante el smoke de deploy; la</w:t>
+        <w:t>• Para H22, cualquier Apply institucional futuro requiere CSV aprobado,</w:t>
       </w:r>
     </w:p>
     <w:p>
@@ -16910,7 +16952,7 @@
           <w:color w:val="334155"/>
           <w:sz w:val="18"/>
         </w:rPr>
-        <w:t xml:space="preserve">  migración 014 debe aplicarse por H05 y conservarse si el incidente es solo</w:t>
+        <w:t xml:space="preserve">  Preview sin bloqueantes, backup y autorización humana independiente. La</w:t>
       </w:r>
     </w:p>
     <w:p>
@@ -16924,7 +16966,21 @@
           <w:color w:val="334155"/>
           <w:sz w:val="18"/>
         </w:rPr>
-        <w:t xml:space="preserve">  de API/UI.</w:t>
+        <w:t xml:space="preserve">  migración 014 ya fue aplicada por H05 y debe conservarse si un incidente es</w:t>
+      </w:r>
+    </w:p>
+    <w:p>
+      <w:pPr>
+        <w:spacing w:after="100"/>
+      </w:pPr>
+      <w:r>
+        <w:rPr>
+          <w:rFonts w:ascii="Aptos" w:hAnsi="Aptos"/>
+          <w:b w:val="0"/>
+          <w:color w:val="334155"/>
+          <w:sz w:val="18"/>
+        </w:rPr>
+        <w:t xml:space="preserve">  solo de API/UI.</w:t>
       </w:r>
     </w:p>
     <w:p>

</xml_diff>

<commit_message>
docs(h22): record responsible owner hotfix deploy
</commit_message>
<xml_diff>
--- a/docs/Manual_Entrega_Nomina_Docente.docx
+++ b/docs/Manual_Entrega_Nomina_Docente.docx
@@ -2257,7 +2257,7 @@
           <w:color w:val="334155"/>
           <w:sz w:val="18"/>
         </w:rPr>
-        <w:t>Estado productivo verificado el 2026-07-31: revisión Cloud Run</w:t>
+        <w:t>Estado productivo verificado el 2026-08-20: revisión Cloud Run</w:t>
       </w:r>
     </w:p>
     <w:p>
@@ -2271,7 +2271,7 @@
           <w:color w:val="334155"/>
           <w:sz w:val="18"/>
         </w:rPr>
-        <w:t>nomina-api-00053-cjg, imagen h22-prod-030ae69, digest</w:t>
+        <w:t>nomina-api-00054-2ld, imagen h22-hf1-081532d, digest</w:t>
       </w:r>
     </w:p>
     <w:p>
@@ -2285,7 +2285,7 @@
           <w:color w:val="334155"/>
           <w:sz w:val="18"/>
         </w:rPr>
-        <w:t>sha256:8e184919579d73fcfc1ecc3b1884edd5da40bc83891d5407d4cc7be95d215028,</w:t>
+        <w:t>sha256:24ea3e66d89ed6f581bbb0ad464decc8531a6738ed9cfaf0094007633b6e471b,</w:t>
       </w:r>
     </w:p>
     <w:p>
@@ -2299,7 +2299,7 @@
           <w:color w:val="334155"/>
           <w:sz w:val="18"/>
         </w:rPr>
-        <w:t>Firebase Hosting release 1785457082597000 y version</w:t>
+        <w:t>Firebase Hosting release 1785536172540000 y version</w:t>
       </w:r>
     </w:p>
     <w:p>
@@ -2313,7 +2313,7 @@
           <w:color w:val="334155"/>
           <w:sz w:val="18"/>
         </w:rPr>
-        <w:t>466c8eb59d99c2dd.</w:t>
+        <w:t>91ba12f3159468b8.</w:t>
       </w:r>
     </w:p>
     <w:p>
@@ -7161,7 +7161,35 @@
           <w:color w:val="334155"/>
           <w:sz w:val="18"/>
         </w:rPr>
-        <w:t>CSV institucional durante el deploy.</w:t>
+        <w:t>CSV institucional durante el deploy original. Una ejecución autorizada</w:t>
+      </w:r>
+    </w:p>
+    <w:p>
+      <w:pPr>
+        <w:spacing w:after="100"/>
+      </w:pPr>
+      <w:r>
+        <w:rPr>
+          <w:rFonts w:ascii="Aptos" w:hAnsi="Aptos"/>
+          <w:b w:val="0"/>
+          <w:color w:val="334155"/>
+          <w:sz w:val="18"/>
+        </w:rPr>
+        <w:t>posterior creó 14 docentes; H22-HF1B corrigió solo su proyección de lectura y</w:t>
+      </w:r>
+    </w:p>
+    <w:p>
+      <w:pPr>
+        <w:spacing w:after="100"/>
+      </w:pPr>
+      <w:r>
+        <w:rPr>
+          <w:rFonts w:ascii="Aptos" w:hAnsi="Aptos"/>
+          <w:b w:val="0"/>
+          <w:color w:val="334155"/>
+          <w:sz w:val="18"/>
+        </w:rPr>
+        <w:t>no repitió Apply.</w:t>
       </w:r>
     </w:p>
     <w:p>
@@ -7526,6 +7554,76 @@
           <w:sz w:val="18"/>
         </w:rPr>
         <w:t>modifica filas.</w:t>
+      </w:r>
+    </w:p>
+    <w:p>
+      <w:pPr>
+        <w:spacing w:after="100"/>
+      </w:pPr>
+      <w:r>
+        <w:rPr>
+          <w:rFonts w:ascii="Aptos" w:hAnsi="Aptos"/>
+          <w:b w:val="0"/>
+          <w:color w:val="334155"/>
+          <w:sz w:val="18"/>
+        </w:rPr>
+        <w:t>El hotfix H22-HF1B corrigió exclusivamente la proyección de lectura de</w:t>
+      </w:r>
+    </w:p>
+    <w:p>
+      <w:pPr>
+        <w:spacing w:after="100"/>
+      </w:pPr>
+      <w:r>
+        <w:rPr>
+          <w:rFonts w:ascii="Aptos" w:hAnsi="Aptos"/>
+          <w:b w:val="0"/>
+          <w:color w:val="334155"/>
+          <w:sz w:val="18"/>
+        </w:rPr>
+        <w:t>Directorio: Responsable operativo muestra nombre/correo del usuario asociado</w:t>
+      </w:r>
+    </w:p>
+    <w:p>
+      <w:pPr>
+        <w:spacing w:after="100"/>
+      </w:pPr>
+      <w:r>
+        <w:rPr>
+          <w:rFonts w:ascii="Aptos" w:hAnsi="Aptos"/>
+          <w:b w:val="0"/>
+          <w:color w:val="334155"/>
+          <w:sz w:val="18"/>
+        </w:rPr>
+        <w:t>a teachers.created_by. No usa coordinationName como sustituto, no muestra</w:t>
+      </w:r>
+    </w:p>
+    <w:p>
+      <w:pPr>
+        <w:spacing w:after="100"/>
+      </w:pPr>
+      <w:r>
+        <w:rPr>
+          <w:rFonts w:ascii="Aptos" w:hAnsi="Aptos"/>
+          <w:b w:val="0"/>
+          <w:color w:val="334155"/>
+          <w:sz w:val="18"/>
+        </w:rPr>
+        <w:t>UUID técnicos y conserva Sin responsable para legacy con created_by IS</w:t>
+      </w:r>
+    </w:p>
+    <w:p>
+      <w:pPr>
+        <w:spacing w:after="100"/>
+      </w:pPr>
+      <w:r>
+        <w:rPr>
+          <w:rFonts w:ascii="Aptos" w:hAnsi="Aptos"/>
+          <w:b w:val="0"/>
+          <w:color w:val="334155"/>
+          <w:sz w:val="18"/>
+        </w:rPr>
+        <w:t>NULL. No requirió corrección de BD, Apply ni migración.</w:t>
       </w:r>
     </w:p>
     <w:p>
@@ -16621,6 +16719,48 @@
           <w:color w:val="334155"/>
           <w:sz w:val="18"/>
         </w:rPr>
+        <w:t>H22-HF1B se desplegó posteriormente en nomina-api-00054-2ld, Hosting release</w:t>
+      </w:r>
+    </w:p>
+    <w:p>
+      <w:pPr>
+        <w:spacing w:after="100"/>
+      </w:pPr>
+      <w:r>
+        <w:rPr>
+          <w:rFonts w:ascii="Aptos" w:hAnsi="Aptos"/>
+          <w:b w:val="0"/>
+          <w:color w:val="334155"/>
+          <w:sz w:val="18"/>
+        </w:rPr>
+        <w:t>1785536172540000. El smoke autenticado confirmó los 14 responsables reales,</w:t>
+      </w:r>
+    </w:p>
+    <w:p>
+      <w:pPr>
+        <w:spacing w:after="100"/>
+      </w:pPr>
+      <w:r>
+        <w:rPr>
+          <w:rFonts w:ascii="Aptos" w:hAnsi="Aptos"/>
+          <w:b w:val="0"/>
+          <w:color w:val="334155"/>
+          <w:sz w:val="18"/>
+        </w:rPr>
+        <w:t>sin ampliar permisos de edición ni exponer datos fiscales.</w:t>
+      </w:r>
+    </w:p>
+    <w:p>
+      <w:pPr>
+        <w:spacing w:after="100"/>
+      </w:pPr>
+      <w:r>
+        <w:rPr>
+          <w:rFonts w:ascii="Aptos" w:hAnsi="Aptos"/>
+          <w:b w:val="0"/>
+          <w:color w:val="334155"/>
+          <w:sz w:val="18"/>
+        </w:rPr>
         <w:t>Rollback:</w:t>
       </w:r>
     </w:p>

</xml_diff>

<commit_message>
docs(h23): record temporal payroll production deploy
</commit_message>
<xml_diff>
--- a/docs/Manual_Entrega_Nomina_Docente.docx
+++ b/docs/Manual_Entrega_Nomina_Docente.docx
@@ -2257,7 +2257,7 @@
           <w:color w:val="334155"/>
           <w:sz w:val="18"/>
         </w:rPr>
-        <w:t>Estado productivo verificado el 2026-08-20: revisión Cloud Run</w:t>
+        <w:t>Estado productivo verificado el 2026-09-01: revisión Cloud Run</w:t>
       </w:r>
     </w:p>
     <w:p>
@@ -2271,7 +2271,7 @@
           <w:color w:val="334155"/>
           <w:sz w:val="18"/>
         </w:rPr>
-        <w:t>nomina-api-00054-2ld, imagen h22-hf1-081532d, digest</w:t>
+        <w:t>nomina-api-00055-8wn, imagen h23-prod-9268d42, digest</w:t>
       </w:r>
     </w:p>
     <w:p>
@@ -2285,7 +2285,7 @@
           <w:color w:val="334155"/>
           <w:sz w:val="18"/>
         </w:rPr>
-        <w:t>sha256:24ea3e66d89ed6f581bbb0ad464decc8531a6738ed9cfaf0094007633b6e471b,</w:t>
+        <w:t>sha256:2e6dcf48aa54669c12a3efbf738737297434a528ba9e8040d9b7fa8638130e92,</w:t>
       </w:r>
     </w:p>
     <w:p>
@@ -2299,7 +2299,7 @@
           <w:color w:val="334155"/>
           <w:sz w:val="18"/>
         </w:rPr>
-        <w:t>Firebase Hosting release 1785536172540000 y version</w:t>
+        <w:t>Firebase Hosting release 1787419305880000 y version</w:t>
       </w:r>
     </w:p>
     <w:p>
@@ -2313,7 +2313,7 @@
           <w:color w:val="334155"/>
           <w:sz w:val="18"/>
         </w:rPr>
-        <w:t>91ba12f3159468b8.</w:t>
+        <w:t>07924eeeb7713f30.</w:t>
       </w:r>
     </w:p>
     <w:p>
@@ -8291,6 +8291,20 @@
           <w:color w:val="334155"/>
           <w:sz w:val="18"/>
         </w:rPr>
+        <w:t>• Vigencia pagable inclusiva de horas base por ciclo.</w:t>
+      </w:r>
+    </w:p>
+    <w:p>
+      <w:pPr>
+        <w:spacing w:after="40"/>
+      </w:pPr>
+      <w:r>
+        <w:rPr>
+          <w:rFonts w:ascii="Aptos" w:hAnsi="Aptos"/>
+          <w:b w:val="0"/>
+          <w:color w:val="334155"/>
+          <w:sz w:val="18"/>
+        </w:rPr>
         <w:t>• Fechas modulares por ciclo.</w:t>
       </w:r>
     </w:p>
@@ -8375,6 +8389,34 @@
           <w:color w:val="334155"/>
           <w:sz w:val="18"/>
         </w:rPr>
+        <w:t>• La vigencia base define el intervalo inclusivo en que Horarios regulares generan L-V/S1/S2 pagables.</w:t>
+      </w:r>
+    </w:p>
+    <w:p>
+      <w:pPr>
+        <w:spacing w:after="40"/>
+      </w:pPr>
+      <w:r>
+        <w:rPr>
+          <w:rFonts w:ascii="Aptos" w:hAnsi="Aptos"/>
+          <w:b w:val="0"/>
+          <w:color w:val="334155"/>
+          <w:sz w:val="18"/>
+        </w:rPr>
+        <w:t>• Módulo 1 y Módulo 2 deben quedar completamente contenidos dentro de la vigencia base.</w:t>
+      </w:r>
+    </w:p>
+    <w:p>
+      <w:pPr>
+        <w:spacing w:after="40"/>
+      </w:pPr>
+      <w:r>
+        <w:rPr>
+          <w:rFonts w:ascii="Aptos" w:hAnsi="Aptos"/>
+          <w:b w:val="0"/>
+          <w:color w:val="334155"/>
+          <w:sz w:val="18"/>
+        </w:rPr>
         <w:t>• Las fechas modulares pertenecen al ciclo, no a cada quincena.</w:t>
       </w:r>
     </w:p>
@@ -8418,6 +8460,20 @@
           <w:sz w:val="18"/>
         </w:rPr>
         <w:t>• La apertura de incidencias y extras debe caer dentro del rango de la quincena.</w:t>
+      </w:r>
+    </w:p>
+    <w:p>
+      <w:pPr>
+        <w:spacing w:after="40"/>
+      </w:pPr>
+      <w:r>
+        <w:rPr>
+          <w:rFonts w:ascii="Aptos" w:hAnsi="Aptos"/>
+          <w:b w:val="0"/>
+          <w:color w:val="334155"/>
+          <w:sz w:val="18"/>
+        </w:rPr>
+        <w:t>• La vigencia base no abre ventanas ni limita Extras independientes; sus ventanas siguen bajo control manual de Admin.</w:t>
       </w:r>
     </w:p>
     <w:p>
@@ -10802,6 +10858,20 @@
           <w:color w:val="334155"/>
           <w:sz w:val="18"/>
         </w:rPr>
+        <w:t>• Vigencia pagable inclusiva de horas base del ciclo.</w:t>
+      </w:r>
+    </w:p>
+    <w:p>
+      <w:pPr>
+        <w:spacing w:after="40"/>
+      </w:pPr>
+      <w:r>
+        <w:rPr>
+          <w:rFonts w:ascii="Aptos" w:hAnsi="Aptos"/>
+          <w:b w:val="0"/>
+          <w:color w:val="334155"/>
+          <w:sz w:val="18"/>
+        </w:rPr>
         <w:t>• Días hábiles L-V dentro del rango.</w:t>
       </w:r>
     </w:p>
@@ -10928,7 +10998,7 @@
           <w:color w:val="334155"/>
           <w:sz w:val="18"/>
         </w:rPr>
-        <w:t>• L-V se multiplica por las veces que cada día aparece en la quincena.</w:t>
+        <w:t>• La quincena se intersecta primero con la vigencia pagable del ciclo.</w:t>
       </w:r>
     </w:p>
     <w:p>
@@ -10942,7 +11012,7 @@
           <w:color w:val="334155"/>
           <w:sz w:val="18"/>
         </w:rPr>
-        <w:t>• Módulo 1 y módulo 2 cuentan sábados recurrentes dentro del rango modular y dentro de la quincena.</w:t>
+        <w:t>• L-V se multiplica por las veces que cada día aparece en esa interseccion.</w:t>
       </w:r>
     </w:p>
     <w:p>
@@ -10956,6 +11026,20 @@
           <w:color w:val="334155"/>
           <w:sz w:val="18"/>
         </w:rPr>
+        <w:t>• Módulo 1 y módulo 2 cuentan sábados recurrentes dentro del rango modular, la vigencia base y la quincena.</w:t>
+      </w:r>
+    </w:p>
+    <w:p>
+      <w:pPr>
+        <w:spacing w:after="40"/>
+      </w:pPr>
+      <w:r>
+        <w:rPr>
+          <w:rFonts w:ascii="Aptos" w:hAnsi="Aptos"/>
+          <w:b w:val="0"/>
+          <w:color w:val="334155"/>
+          <w:sz w:val="18"/>
+        </w:rPr>
         <w:t>• Puede haber quincenas con traslape operativo entre L-V, M1 y M2.</w:t>
       </w:r>
     </w:p>
@@ -11013,6 +11097,34 @@
           <w:sz w:val="18"/>
         </w:rPr>
         <w:t>• Extras externos suman al tabulador asignado al extra.</w:t>
+      </w:r>
+    </w:p>
+    <w:p>
+      <w:pPr>
+        <w:spacing w:after="40"/>
+      </w:pPr>
+      <w:r>
+        <w:rPr>
+          <w:rFonts w:ascii="Aptos" w:hAnsi="Aptos"/>
+          <w:b w:val="0"/>
+          <w:color w:val="334155"/>
+          <w:sz w:val="18"/>
+        </w:rPr>
+        <w:t>• Sin ocurrencias base elegibles, faltas, retardos y extras de incidencia aportan cero.</w:t>
+      </w:r>
+    </w:p>
+    <w:p>
+      <w:pPr>
+        <w:spacing w:after="40"/>
+      </w:pPr>
+      <w:r>
+        <w:rPr>
+          <w:rFonts w:ascii="Aptos" w:hAnsi="Aptos"/>
+          <w:b w:val="0"/>
+          <w:color w:val="334155"/>
+          <w:sz w:val="18"/>
+        </w:rPr>
+        <w:t>• Extras independientes conservan su elegibilidad por fecha, quincena y ventana administrativa.</w:t>
       </w:r>
     </w:p>
     <w:p>
@@ -16836,6 +16948,238 @@
     </w:p>
     <w:p>
       <w:pPr>
+        <w:pStyle w:val="Heading2"/>
+      </w:pPr>
+      <w:r>
+        <w:t>12.6 Resultado del despliegue H23</w:t>
+      </w:r>
+    </w:p>
+    <w:p>
+      <w:pPr>
+        <w:spacing w:after="100"/>
+      </w:pPr>
+      <w:r>
+        <w:rPr>
+          <w:rFonts w:ascii="Aptos" w:hAnsi="Aptos"/>
+          <w:b w:val="0"/>
+          <w:color w:val="334155"/>
+          <w:sz w:val="18"/>
+        </w:rPr>
+        <w:t>H23-F4 se ejecuto como ventana controlada:</w:t>
+      </w:r>
+    </w:p>
+    <w:p>
+      <w:pPr>
+        <w:spacing w:after="40"/>
+      </w:pPr>
+      <w:r>
+        <w:rPr>
+          <w:rFonts w:ascii="Aptos" w:hAnsi="Aptos"/>
+          <w:b w:val="0"/>
+          <w:color w:val="334155"/>
+          <w:sz w:val="18"/>
+        </w:rPr>
+        <w:t>1. Backup 1787418742938, estado SUCCESSFUL.</w:t>
+      </w:r>
+    </w:p>
+    <w:p>
+      <w:pPr>
+        <w:spacing w:after="40"/>
+      </w:pPr>
+      <w:r>
+        <w:rPr>
+          <w:rFonts w:ascii="Aptos" w:hAnsi="Aptos"/>
+          <w:b w:val="0"/>
+          <w:color w:val="334155"/>
+          <w:sz w:val="18"/>
+        </w:rPr>
+        <w:t>2. Migracion 015_h23_cycle_base_hours_dates.sql aplicada exclusivamente mediante H05.</w:t>
+      </w:r>
+    </w:p>
+    <w:p>
+      <w:pPr>
+        <w:spacing w:after="40"/>
+      </w:pPr>
+      <w:r>
+        <w:rPr>
+          <w:rFonts w:ascii="Aptos" w:hAnsi="Aptos"/>
+          <w:b w:val="0"/>
+          <w:color w:val="334155"/>
+          <w:sz w:val="18"/>
+        </w:rPr>
+        <w:t>3. H05 final: 18 registradas, 15 baseline, 013/014/015 aplicadas, pending=0 y checksum mismatch=0.</w:t>
+      </w:r>
+    </w:p>
+    <w:p>
+      <w:pPr>
+        <w:spacing w:after="40"/>
+      </w:pPr>
+      <w:r>
+        <w:rPr>
+          <w:rFonts w:ascii="Aptos" w:hAnsi="Aptos"/>
+          <w:b w:val="0"/>
+          <w:color w:val="334155"/>
+          <w:sz w:val="18"/>
+        </w:rPr>
+        <w:t>4. Ciclo 27-1 configurado con vigencia pagable 2026-08-31 a 2026-12-12; M1/M2 permanecieron sin cambios y contenidos.</w:t>
+      </w:r>
+    </w:p>
+    <w:p>
+      <w:pPr>
+        <w:spacing w:after="40"/>
+      </w:pPr>
+      <w:r>
+        <w:rPr>
+          <w:rFonts w:ascii="Aptos" w:hAnsi="Aptos"/>
+          <w:b w:val="0"/>
+          <w:color w:val="334155"/>
+          <w:sz w:val="18"/>
+        </w:rPr>
+        <w:t>5. API desplegada en nomina-api-00055-8wn, 100% del trafico.</w:t>
+      </w:r>
+    </w:p>
+    <w:p>
+      <w:pPr>
+        <w:spacing w:after="40"/>
+      </w:pPr>
+      <w:r>
+        <w:rPr>
+          <w:rFonts w:ascii="Aptos" w:hAnsi="Aptos"/>
+          <w:b w:val="0"/>
+          <w:color w:val="334155"/>
+          <w:sz w:val="18"/>
+        </w:rPr>
+        <w:t>6. Hosting live release 1787419305880000, version 07924eeeb7713f30.</w:t>
+      </w:r>
+    </w:p>
+    <w:p>
+      <w:pPr>
+        <w:spacing w:after="40"/>
+      </w:pPr>
+      <w:r>
+        <w:rPr>
+          <w:rFonts w:ascii="Aptos" w:hAnsi="Aptos"/>
+          <w:b w:val="0"/>
+          <w:color w:val="334155"/>
+          <w:sz w:val="18"/>
+        </w:rPr>
+        <w:t>7. Healthchecks HTTP 200, rutas protegidas sin sesion HTTP 401 y cero logs severos atribuibles a H23.</w:t>
+      </w:r>
+    </w:p>
+    <w:p>
+      <w:pPr>
+        <w:spacing w:after="40"/>
+      </w:pPr>
+      <w:r>
+        <w:rPr>
+          <w:rFonts w:ascii="Aptos" w:hAnsi="Aptos"/>
+          <w:b w:val="0"/>
+          <w:color w:val="334155"/>
+          <w:sz w:val="18"/>
+        </w:rPr>
+        <w:t>8. Smoke de Calendario, Preview, Incidencias, Reporte vivo, H20 y responsive aprobado.</w:t>
+      </w:r>
+    </w:p>
+    <w:p>
+      <w:pPr>
+        <w:spacing w:after="40"/>
+      </w:pPr>
+      <w:r>
+        <w:rPr>
+          <w:rFonts w:ascii="Aptos" w:hAnsi="Aptos"/>
+          <w:b w:val="0"/>
+          <w:color w:val="334155"/>
+          <w:sz w:val="18"/>
+        </w:rPr>
+        <w:t>9. La quincena 2026-08-10 a 2026-08-22 produce L-V, M1, M2, base e incidencias en cero.</w:t>
+      </w:r>
+    </w:p>
+    <w:p>
+      <w:pPr>
+        <w:spacing w:after="40"/>
+      </w:pPr>
+      <w:r>
+        <w:rPr>
+          <w:rFonts w:ascii="Aptos" w:hAnsi="Aptos"/>
+          <w:b w:val="0"/>
+          <w:color w:val="334155"/>
+          <w:sz w:val="18"/>
+        </w:rPr>
+        <w:t>10. No se guardo ni cancelo Nomina, no se abrio la ventana de Extras y no se capturaron propedeuticos.</w:t>
+      </w:r>
+    </w:p>
+    <w:p>
+      <w:pPr>
+        <w:spacing w:after="100"/>
+      </w:pPr>
+      <w:r>
+        <w:rPr>
+          <w:rFonts w:ascii="Aptos" w:hAnsi="Aptos"/>
+          <w:b w:val="0"/>
+          <w:color w:val="334155"/>
+          <w:sz w:val="18"/>
+        </w:rPr>
+        <w:t>Rollback H23:</w:t>
+      </w:r>
+    </w:p>
+    <w:p>
+      <w:pPr>
+        <w:spacing w:after="40"/>
+      </w:pPr>
+      <w:r>
+        <w:rPr>
+          <w:rFonts w:ascii="Aptos" w:hAnsi="Aptos"/>
+          <w:b w:val="0"/>
+          <w:color w:val="334155"/>
+          <w:sz w:val="18"/>
+        </w:rPr>
+        <w:t>• API: regresar trafico a nomina-api-00054-2ld.</w:t>
+      </w:r>
+    </w:p>
+    <w:p>
+      <w:pPr>
+        <w:spacing w:after="40"/>
+      </w:pPr>
+      <w:r>
+        <w:rPr>
+          <w:rFonts w:ascii="Aptos" w:hAnsi="Aptos"/>
+          <w:b w:val="0"/>
+          <w:color w:val="334155"/>
+          <w:sz w:val="18"/>
+        </w:rPr>
+        <w:t>• Hosting: restaurar release 1785536172540000, version 91ba12f3159468b8.</w:t>
+      </w:r>
+    </w:p>
+    <w:p>
+      <w:pPr>
+        <w:spacing w:after="40"/>
+      </w:pPr>
+      <w:r>
+        <w:rPr>
+          <w:rFonts w:ascii="Aptos" w:hAnsi="Aptos"/>
+          <w:b w:val="0"/>
+          <w:color w:val="334155"/>
+          <w:sz w:val="18"/>
+        </w:rPr>
+        <w:t>• Las columnas y fechas H23 pueden permanecer porque el codigo anterior las ignora.</w:t>
+      </w:r>
+    </w:p>
+    <w:p>
+      <w:pPr>
+        <w:spacing w:after="40"/>
+      </w:pPr>
+      <w:r>
+        <w:rPr>
+          <w:rFonts w:ascii="Aptos" w:hAnsi="Aptos"/>
+          <w:b w:val="0"/>
+          <w:color w:val="334155"/>
+          <w:sz w:val="18"/>
+        </w:rPr>
+        <w:t>• No eliminar constraints ni ejecutar SQL inverso improvisado.</w:t>
+      </w:r>
+    </w:p>
+    <w:p>
+      <w:pPr>
         <w:pStyle w:val="Heading1"/>
       </w:pPr>
       <w:r>

</xml_diff>